<commit_message>
Remove all trace of setting the hop size.
</commit_message>
<xml_diff>
--- a/Documentation/Demo-Script.docx
+++ b/Documentation/Demo-Script.docx
@@ -27,11 +27,11 @@
         </w:rPr>
       </w:r>
       <w:r>
-        <w:rPr>
-          <w:noProof/>
-        </w:rPr>
-        <w:pict>
-          <v:rect id="_x0000_i1025" style="width:0;height:1.5pt" o:hralign="center" o:hrstd="t" o:hr="t"/>
+        <w:pict w14:anchorId="05759DAF">
+          <v:rect id="Horizontal Line 1" o:spid="_x0000_s1034" style="width:468pt;height:1.1pt;visibility:visible;mso-wrap-style:square;mso-left-percent:-10001;mso-top-percent:-10001;mso-position-horizontal:absolute;mso-position-horizontal-relative:char;mso-position-vertical:absolute;mso-position-vertical-relative:line;mso-left-percent:-10001;mso-top-percent:-10001;v-text-anchor:top" o:gfxdata="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" filled="f">
+            <o:lock v:ext="edit" rotation="t" aspectratio="t" verticies="t" text="t" shapetype="t"/>
+            <w10:anchorlock/>
+          </v:rect>
         </w:pict>
       </w:r>
     </w:p>
@@ -82,11 +82,11 @@
         </w:rPr>
       </w:r>
       <w:r>
-        <w:rPr>
-          <w:noProof/>
-        </w:rPr>
-        <w:pict>
-          <v:rect id="_x0000_i1026" style="width:0;height:1.5pt" o:hralign="center" o:hrstd="t" o:hr="t"/>
+        <w:pict w14:anchorId="2EE92FF5">
+          <v:rect id="Horizontal Line 2" o:spid="_x0000_s1033" style="width:468pt;height:1.1pt;visibility:visible;mso-wrap-style:square;mso-left-percent:-10001;mso-top-percent:-10001;mso-position-horizontal:absolute;mso-position-horizontal-relative:char;mso-position-vertical:absolute;mso-position-vertical-relative:line;mso-left-percent:-10001;mso-top-percent:-10001;v-text-anchor:top" o:gfxdata="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" filled="f">
+            <o:lock v:ext="edit" rotation="t" aspectratio="t" verticies="t" text="t" shapetype="t"/>
+            <w10:anchorlock/>
+          </v:rect>
         </w:pict>
       </w:r>
     </w:p>
@@ -274,18 +274,30 @@
         </w:numPr>
       </w:pPr>
       <w:r>
-        <w:t xml:space="preserve">Audio INPU </w:t>
-      </w:r>
-      <w:r>
-        <w:t xml:space="preserve"> Settings</w:t>
+        <w:t>Audio I</w:t>
+      </w:r>
+      <w:r>
+        <w:t>nput &amp; Calibration</w:t>
       </w:r>
     </w:p>
     <w:p>
       <w:pPr>
         <w:pStyle w:val="BodyText"/>
+        <w:numPr>
+          <w:ilvl w:val="1"/>
+          <w:numId w:val="3"/>
+        </w:numPr>
       </w:pPr>
       <w:r>
         <w:lastRenderedPageBreak/>
+        <w:t>Help</w:t>
+      </w:r>
+    </w:p>
+    <w:p>
+      <w:pPr>
+        <w:pStyle w:val="BodyText"/>
+      </w:pPr>
+      <w:r>
         <w:t>The live spectrum updating with ambient room noise - The frequency axis (75–350 Hz range showing the luthier-relevant range) - The results panel on the right side of the window</w:t>
       </w:r>
     </w:p>
@@ -296,11 +308,11 @@
         </w:rPr>
       </w:r>
       <w:r>
-        <w:rPr>
-          <w:noProof/>
-        </w:rPr>
-        <w:pict>
-          <v:rect id="_x0000_i1027" style="width:0;height:1.5pt" o:hralign="center" o:hrstd="t" o:hr="t"/>
+        <w:pict w14:anchorId="33CA545B">
+          <v:rect id="Horizontal Line 3" o:spid="_x0000_s1032" style="width:468pt;height:1.1pt;visibility:visible;mso-wrap-style:square;mso-left-percent:-10001;mso-top-percent:-10001;mso-position-horizontal:absolute;mso-position-horizontal-relative:char;mso-position-vertical:absolute;mso-position-vertical-relative:line;mso-left-percent:-10001;mso-top-percent:-10001;v-text-anchor:top" o:gfxdata="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" filled="f">
+            <o:lock v:ext="edit" rotation="t" aspectratio="t" verticies="t" text="t" shapetype="t"/>
+            <w10:anchorlock/>
+          </v:rect>
         </w:pict>
       </w:r>
     </w:p>
@@ -637,11 +649,11 @@
         </w:rPr>
       </w:r>
       <w:r>
-        <w:rPr>
-          <w:noProof/>
-        </w:rPr>
-        <w:pict>
-          <v:rect id="_x0000_i1028" style="width:0;height:1.5pt" o:hralign="center" o:hrstd="t" o:hr="t"/>
+        <w:pict w14:anchorId="066661F3">
+          <v:rect id="Horizontal Line 4" o:spid="_x0000_s1031" style="width:468pt;height:1.1pt;visibility:visible;mso-wrap-style:square;mso-left-percent:-10001;mso-top-percent:-10001;mso-position-horizontal:absolute;mso-position-horizontal-relative:char;mso-position-vertical:absolute;mso-position-vertical-relative:line;mso-left-percent:-10001;mso-top-percent:-10001;v-text-anchor:top" o:gfxdata="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" filled="f">
+            <o:lock v:ext="edit" rotation="t" aspectratio="t" verticies="t" text="t" shapetype="t"/>
+            <w10:anchorlock/>
+          </v:rect>
         </w:pict>
       </w:r>
     </w:p>
@@ -771,11 +783,11 @@
         </w:rPr>
       </w:r>
       <w:r>
-        <w:rPr>
-          <w:noProof/>
-        </w:rPr>
-        <w:pict>
-          <v:rect id="_x0000_i1029" style="width:0;height:1.5pt" o:hralign="center" o:hrstd="t" o:hr="t"/>
+        <w:pict w14:anchorId="29053E8C">
+          <v:rect id="Horizontal Line 5" o:spid="_x0000_s1030" style="width:468pt;height:1.1pt;visibility:visible;mso-wrap-style:square;mso-left-percent:-10001;mso-top-percent:-10001;mso-position-horizontal:absolute;mso-position-horizontal-relative:char;mso-position-vertical:absolute;mso-position-vertical-relative:line;mso-left-percent:-10001;mso-top-percent:-10001;v-text-anchor:top" o:gfxdata="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" filled="f">
+            <o:lock v:ext="edit" rotation="t" aspectratio="t" verticies="t" text="t" shapetype="t"/>
+            <w10:anchorlock/>
+          </v:rect>
         </w:pict>
       </w:r>
     </w:p>
@@ -1108,11 +1120,11 @@
         </w:rPr>
       </w:r>
       <w:r>
-        <w:rPr>
-          <w:noProof/>
-        </w:rPr>
-        <w:pict>
-          <v:rect id="_x0000_i1030" style="width:0;height:1.5pt" o:hralign="center" o:hrstd="t" o:hr="t"/>
+        <w:pict w14:anchorId="7970F7FB">
+          <v:rect id="Horizontal Line 6" o:spid="_x0000_s1029" style="width:468pt;height:1.1pt;visibility:visible;mso-wrap-style:square;mso-left-percent:-10001;mso-top-percent:-10001;mso-position-horizontal:absolute;mso-position-horizontal-relative:char;mso-position-vertical:absolute;mso-position-vertical-relative:line;mso-left-percent:-10001;mso-top-percent:-10001;v-text-anchor:top" o:gfxdata="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" filled="f">
+            <o:lock v:ext="edit" rotation="t" aspectratio="t" verticies="t" text="t" shapetype="t"/>
+            <w10:anchorlock/>
+          </v:rect>
         </w:pict>
       </w:r>
     </w:p>
@@ -1203,11 +1215,11 @@
         </w:rPr>
       </w:r>
       <w:r>
-        <w:rPr>
-          <w:noProof/>
-        </w:rPr>
-        <w:pict>
-          <v:rect id="_x0000_i1031" style="width:0;height:1.5pt" o:hralign="center" o:hrstd="t" o:hr="t"/>
+        <w:pict w14:anchorId="0F7B5C20">
+          <v:rect id="Horizontal Line 7" o:spid="_x0000_s1028" style="width:468pt;height:1.1pt;visibility:visible;mso-wrap-style:square;mso-left-percent:-10001;mso-top-percent:-10001;mso-position-horizontal:absolute;mso-position-horizontal-relative:char;mso-position-vertical:absolute;mso-position-vertical-relative:line;mso-left-percent:-10001;mso-top-percent:-10001;v-text-anchor:top" o:gfxdata="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" filled="f">
+            <o:lock v:ext="edit" rotation="t" aspectratio="t" verticies="t" text="t" shapetype="t"/>
+            <w10:anchorlock/>
+          </v:rect>
         </w:pict>
       </w:r>
     </w:p>
@@ -1282,11 +1294,11 @@
         </w:rPr>
       </w:r>
       <w:r>
-        <w:rPr>
-          <w:noProof/>
-        </w:rPr>
-        <w:pict>
-          <v:rect id="_x0000_i1032" style="width:0;height:1.5pt" o:hralign="center" o:hrstd="t" o:hr="t"/>
+        <w:pict w14:anchorId="69669C2F">
+          <v:rect id="Horizontal Line 8" o:spid="_x0000_s1027" style="width:468pt;height:1.1pt;visibility:visible;mso-wrap-style:square;mso-left-percent:-10001;mso-top-percent:-10001;mso-position-horizontal:absolute;mso-position-horizontal-relative:char;mso-position-vertical:absolute;mso-position-vertical-relative:line;mso-left-percent:-10001;mso-top-percent:-10001;v-text-anchor:top" o:gfxdata="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" filled="f">
+            <o:lock v:ext="edit" rotation="t" aspectratio="t" verticies="t" text="t" shapetype="t"/>
+            <w10:anchorlock/>
+          </v:rect>
         </w:pict>
       </w:r>
     </w:p>
@@ -1335,11 +1347,11 @@
         </w:rPr>
       </w:r>
       <w:r>
-        <w:rPr>
-          <w:noProof/>
-        </w:rPr>
-        <w:pict>
-          <v:rect id="_x0000_i1033" style="width:0;height:1.5pt" o:hralign="center" o:hrstd="t" o:hr="t"/>
+        <w:pict w14:anchorId="3A6D7CC1">
+          <v:rect id="Horizontal Line 9" o:spid="_x0000_s1026" style="width:468pt;height:1.1pt;visibility:visible;mso-wrap-style:square;mso-left-percent:-10001;mso-top-percent:-10001;mso-position-horizontal:absolute;mso-position-horizontal-relative:char;mso-position-vertical:absolute;mso-position-vertical-relative:line;mso-left-percent:-10001;mso-top-percent:-10001;v-text-anchor:top" o:gfxdata="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" filled="f">
+            <o:lock v:ext="edit" rotation="t" aspectratio="t" verticies="t" text="t" shapetype="t"/>
+            <w10:anchorlock/>
+          </v:rect>
         </w:pict>
       </w:r>
     </w:p>

</xml_diff>